<commit_message>
Informe de revisión: factura electrónica confirmada (P25, F6, DEC3)
Co-Authored-By: Claude Sonnet 5.5 <noreply@anthropic.com>
Claude-Session: https://claude.ai/code/session_014sTYdWfkk1Ar7c1xDyjJPW
</commit_message>
<xml_diff>
--- a/documentos/ECRISTIA-Informe-de-revision-del-sitio.docx
+++ b/documentos/ECRISTIA-Informe-de-revision-del-sitio.docx
@@ -3183,7 +3183,7 @@
                 <w:sz w:val="18"/>
                 <w:szCs w:val="18"/>
               </w:rPr>
-              <w:t xml:space="preserve">Contrato y factura</w:t>
+              <w:t xml:space="preserve">Contrato (la factura ya está confirmada)</w:t>
             </w:r>
           </w:p>
         </w:tc>
@@ -3216,7 +3216,7 @@
                 <w:sz w:val="18"/>
                 <w:szCs w:val="18"/>
               </w:rPr>
-              <w:t xml:space="preserve">El sitio dice “Contrato Digital y Factura Legal” (P25) y “Sí, damos factura” (F6). Antes de publicarlo hay que confirmar con un contador cómo vas a facturar (RUC, timbrado o factura electrónica) y si usarás contrato. Propongo quitar el sello P25 por ahora.</w:t>
+              <w:t xml:space="preserve">Ya confirmaste que tienes factura electrónica con tu RUC, así que el sitio puede decirlo (P25 y F6). Queda una duda: el sello decía “Contrato Digital”. ¿Vas a firmar un contrato con cada cliente? Si es así, dime cómo (PDF firmado, aceptación por WhatsApp) y lo añado. Si no, el sello queda solo como “Con factura electrónica”.</w:t>
             </w:r>
           </w:p>
         </w:tc>
@@ -15694,7 +15694,7 @@
                 <w:sz w:val="18"/>
                 <w:szCs w:val="18"/>
               </w:rPr>
-              <w:t xml:space="preserve">(eliminar hasta confirmar)</w:t>
+              <w:t xml:space="preserve">Con factura electrónica</w:t>
             </w:r>
           </w:p>
         </w:tc>
@@ -15727,7 +15727,7 @@
                 <w:sz w:val="18"/>
                 <w:szCs w:val="18"/>
               </w:rPr>
-              <w:t xml:space="preserve">No definiste contrato digital ni el sistema de factura. Ver DEC3.</w:t>
+              <w:t xml:space="preserve">Confirmaste que tienes factura electrónica. “Contrato digital” queda fuera hasta que decidas si lo usarás. Ver DEC3.</w:t>
             </w:r>
           </w:p>
         </w:tc>
@@ -25436,7 +25436,7 @@
                 <w:sz w:val="18"/>
                 <w:szCs w:val="18"/>
               </w:rPr>
-              <w:t xml:space="preserve">¿Das factura? · Sí, todos los precios incluyen IVA.</w:t>
+              <w:t xml:space="preserve">¿Das factura? · Sí, emito factura electrónica y todos los precios incluyen IVA.</w:t>
             </w:r>
           </w:p>
         </w:tc>
@@ -25469,7 +25469,7 @@
                 <w:sz w:val="18"/>
                 <w:szCs w:val="18"/>
               </w:rPr>
-              <w:t xml:space="preserve">Confirmar antes cómo vas a facturar. Ver DEC3.</w:t>
+              <w:t xml:space="preserve">Confirmaste que tienes factura electrónica con RUC.</w:t>
             </w:r>
           </w:p>
         </w:tc>

</xml_diff>